<commit_message>
done fix generated doc
</commit_message>
<xml_diff>
--- a/client/public/documents/dodatok-3-zayava.docx
+++ b/client/public/documents/dodatok-3-zayava.docx
@@ -77,7 +77,38 @@
         </w:rPr>
       </w:pPr>
       <w:r>
-        <w:t xml:space="preserve">Керівнику  {{operatorRecipient}}</w:t>
+        <w:rPr>
+          <w:lang w:val="uk-UA"/>
+        </w:rPr>
+        <w:t xml:space="preserve">Керівнику  </w:t>
+      </w:r>
+      <w:r>
+        <w:rPr>
+          <w:bCs/>
+          <w:lang w:val="uk-UA"/>
+        </w:rPr>
+        <w:t>___</w:t>
+      </w:r>
+      <w:r>
+        <w:rPr>
+          <w:bCs/>
+          <w:lang w:val="uk-UA"/>
+        </w:rPr>
+        <w:t>___________</w:t>
+      </w:r>
+      <w:r>
+        <w:rPr>
+          <w:bCs/>
+          <w:lang w:val="uk-UA"/>
+        </w:rPr>
+        <w:t>____________</w:t>
+      </w:r>
+      <w:r>
+        <w:rPr>
+          <w:bCs/>
+          <w:lang w:val="uk-UA"/>
+        </w:rPr>
+        <w:t>_________</w:t>
       </w:r>
     </w:p>
     <w:p>
@@ -204,7 +235,45 @@
         </w:rPr>
       </w:pPr>
       <w:r>
-        <w:t xml:space="preserve">Від {{customerName}}</w:t>
+        <w:rPr>
+          <w:bCs/>
+          <w:lang w:val="uk-UA"/>
+        </w:rPr>
+        <w:t>Від</w:t>
+      </w:r>
+      <w:r>
+        <w:rPr>
+          <w:bCs/>
+          <w:lang w:val="uk-UA"/>
+        </w:rPr>
+        <w:t xml:space="preserve"> </w:t>
+      </w:r>
+      <w:r>
+        <w:rPr>
+          <w:bCs/>
+          <w:lang w:val="uk-UA"/>
+        </w:rPr>
+        <w:t>_________________</w:t>
+      </w:r>
+      <w:r>
+        <w:rPr>
+          <w:lang w:val="uk-UA"/>
+        </w:rPr>
+        <w:t>_______</w:t>
+      </w:r>
+      <w:r>
+        <w:rPr>
+          <w:bCs/>
+          <w:lang w:val="uk-UA"/>
+        </w:rPr>
+        <w:t>_______</w:t>
+      </w:r>
+      <w:r>
+        <w:rPr>
+          <w:bCs/>
+          <w:lang w:val="uk-UA"/>
+        </w:rPr>
+        <w:t>___________</w:t>
       </w:r>
     </w:p>
     <w:p>
@@ -271,7 +340,45 @@
         </w:rPr>
       </w:pPr>
       <w:r>
-        <w:t xml:space="preserve">Адреса: {{mailingAddress}}</w:t>
+        <w:rPr>
+          <w:bCs/>
+          <w:lang w:val="uk-UA"/>
+        </w:rPr>
+        <w:t>Адреса:</w:t>
+      </w:r>
+      <w:r>
+        <w:rPr>
+          <w:bCs/>
+          <w:lang w:val="uk-UA"/>
+        </w:rPr>
+        <w:t xml:space="preserve"> </w:t>
+      </w:r>
+      <w:r>
+        <w:rPr>
+          <w:bCs/>
+          <w:lang w:val="uk-UA"/>
+        </w:rPr>
+        <w:t>____</w:t>
+      </w:r>
+      <w:r>
+        <w:rPr>
+          <w:lang w:val="uk-UA"/>
+        </w:rPr>
+        <w:t>_____</w:t>
+      </w:r>
+      <w:r>
+        <w:rPr>
+          <w:bCs/>
+          <w:lang w:val="uk-UA"/>
+        </w:rPr>
+        <w:t>_________________</w:t>
+      </w:r>
+      <w:r>
+        <w:rPr>
+          <w:bCs/>
+          <w:lang w:val="uk-UA"/>
+        </w:rPr>
+        <w:t>____________</w:t>
       </w:r>
     </w:p>
     <w:p>
@@ -365,7 +472,38 @@
         </w:rPr>
       </w:pPr>
       <w:r>
-        <w:t xml:space="preserve">Електронна адреса {{customerEmail}}</w:t>
+        <w:rPr>
+          <w:bCs/>
+          <w:lang w:val="uk-UA"/>
+        </w:rPr>
+        <w:t>Електронна адреса</w:t>
+      </w:r>
+      <w:r>
+        <w:rPr>
+          <w:bCs/>
+          <w:lang w:val="uk-UA"/>
+        </w:rPr>
+        <w:t xml:space="preserve"> </w:t>
+      </w:r>
+      <w:r>
+        <w:rPr>
+          <w:lang w:val="uk-UA"/>
+        </w:rPr>
+        <w:t>_</w:t>
+      </w:r>
+      <w:r>
+        <w:rPr>
+          <w:bCs/>
+          <w:lang w:val="uk-UA"/>
+        </w:rPr>
+        <w:t>________________</w:t>
+      </w:r>
+      <w:r>
+        <w:rPr>
+          <w:bCs/>
+          <w:lang w:val="uk-UA"/>
+        </w:rPr>
+        <w:t>____________</w:t>
       </w:r>
     </w:p>
     <w:p>
@@ -390,8 +528,46 @@
           <w:szCs w:val="24"/>
         </w:rPr>
       </w:pPr>
-      <w:r>
-        <w:t xml:space="preserve">Тел. {{customerPhone}}</w:t>
+      <w:proofErr w:type="spellStart"/>
+      <w:r>
+        <w:rPr>
+          <w:bCs/>
+          <w:sz w:val="24"/>
+          <w:szCs w:val="24"/>
+        </w:rPr>
+        <w:t>Тел</w:t>
+      </w:r>
+      <w:proofErr w:type="spellEnd"/>
+      <w:r>
+        <w:rPr>
+          <w:bCs/>
+          <w:sz w:val="24"/>
+          <w:szCs w:val="24"/>
+        </w:rPr>
+        <w:t>. ________</w:t>
+      </w:r>
+      <w:r>
+        <w:rPr>
+          <w:sz w:val="24"/>
+          <w:szCs w:val="24"/>
+        </w:rPr>
+        <w:t>_____</w:t>
+      </w:r>
+      <w:r>
+        <w:rPr>
+          <w:bCs/>
+          <w:sz w:val="24"/>
+          <w:szCs w:val="24"/>
+        </w:rPr>
+        <w:t>________________</w:t>
+      </w:r>
+      <w:r>
+        <w:rPr>
+          <w:bCs/>
+          <w:sz w:val="24"/>
+          <w:szCs w:val="24"/>
+        </w:rPr>
+        <w:t>____________</w:t>
       </w:r>
     </w:p>
     <w:p>
@@ -454,7 +630,39 @@
         </w:rPr>
       </w:pPr>
       <w:r>
-        <w:t xml:space="preserve">Прошу надати послугу з приєднання до теплових мереж {{operatorName}}</w:t>
+        <w:rPr>
+          <w:bCs/>
+          <w:lang w:val="uk-UA"/>
+        </w:rPr>
+        <w:t xml:space="preserve">Прошу </w:t>
+      </w:r>
+      <w:r>
+        <w:rPr>
+          <w:bCs/>
+          <w:lang w:val="uk-UA"/>
+        </w:rPr>
+        <w:t>надати послугу з при</w:t>
+      </w:r>
+      <w:r>
+        <w:rPr>
+          <w:bCs/>
+          <w:lang w:val="uk-UA"/>
+        </w:rPr>
+        <w:t>є</w:t>
+      </w:r>
+      <w:r>
+        <w:rPr>
+          <w:bCs/>
+          <w:lang w:val="uk-UA"/>
+        </w:rPr>
+        <w:t xml:space="preserve">днання до теплових мереж </w:t>
+      </w:r>
+      <w:r>
+        <w:rPr>
+          <w:bCs/>
+          <w:lang w:val="uk-UA"/>
+        </w:rPr>
+        <w:t>_____________________________________________________________________________________</w:t>
       </w:r>
     </w:p>
     <w:p>
@@ -530,7 +738,25 @@
         </w:rPr>
       </w:pPr>
       <w:r>
-        <w:t xml:space="preserve">??????? ????????? {{objectSummary}}</w:t>
+        <w:rPr>
+          <w:bCs/>
+          <w:lang w:val="uk-UA"/>
+        </w:rPr>
+        <w:t>об’</w:t>
+      </w:r>
+      <w:r>
+        <w:rPr>
+          <w:bCs/>
+          <w:lang w:val="uk-UA"/>
+        </w:rPr>
+        <w:t>є</w:t>
+      </w:r>
+      <w:r>
+        <w:rPr>
+          <w:bCs/>
+          <w:lang w:val="uk-UA"/>
+        </w:rPr>
+        <w:t>кта замовника_____________________________________________________________________</w:t>
       </w:r>
     </w:p>
     <w:p>
@@ -589,7 +815,97 @@
         </w:rPr>
       </w:pPr>
       <w:r>
-        <w:t xml:space="preserve">у зв’язку: {{connectionReason}}; з необхідністью приєднання до теплових мереж об’єкта, який не був підключений до теплових мереж Оператора; збільшення теплового навантаження або теплової потужності об'єкта; зміни вимог до надійності транспортування та якості теплової енергії; зміни вимог нормативно-правових актів (необхідне підкреслити).</w:t>
+        <w:rPr>
+          <w:lang w:val="uk-UA"/>
+        </w:rPr>
+        <w:t xml:space="preserve">у </w:t>
+      </w:r>
+      <w:r>
+        <w:rPr>
+          <w:lang w:val="uk-UA"/>
+        </w:rPr>
+        <w:t>зв’язку</w:t>
+      </w:r>
+      <w:r>
+        <w:rPr>
+          <w:lang w:val="uk-UA"/>
+        </w:rPr>
+        <w:t>:</w:t>
+      </w:r>
+      <w:r>
+        <w:rPr>
+          <w:lang w:val="uk-UA"/>
+        </w:rPr>
+        <w:t xml:space="preserve"> з </w:t>
+      </w:r>
+      <w:proofErr w:type="spellStart"/>
+      <w:r>
+        <w:rPr>
+          <w:lang w:val="uk-UA"/>
+        </w:rPr>
+        <w:t>необхідністью</w:t>
+      </w:r>
+      <w:proofErr w:type="spellEnd"/>
+      <w:r>
+        <w:rPr>
+          <w:lang w:val="uk-UA"/>
+        </w:rPr>
+        <w:t xml:space="preserve"> приєднання до теплових мереж об’єкта, який не був підключений до теплових </w:t>
+      </w:r>
+      <w:r>
+        <w:rPr>
+          <w:lang w:val="uk-UA"/>
+        </w:rPr>
+        <w:t xml:space="preserve">мереж </w:t>
+      </w:r>
+      <w:r>
+        <w:rPr>
+          <w:lang w:val="uk-UA"/>
+        </w:rPr>
+        <w:t>О</w:t>
+      </w:r>
+      <w:r>
+        <w:rPr>
+          <w:lang w:val="uk-UA"/>
+        </w:rPr>
+        <w:t>ператора</w:t>
+      </w:r>
+      <w:r>
+        <w:rPr>
+          <w:lang w:val="uk-UA"/>
+        </w:rPr>
+        <w:t>; збільшення теплового навантаження або теплової потужності об'єкта;</w:t>
+      </w:r>
+      <w:r>
+        <w:rPr>
+          <w:lang w:val="uk-UA"/>
+        </w:rPr>
+        <w:t xml:space="preserve"> </w:t>
+      </w:r>
+      <w:r>
+        <w:rPr>
+          <w:lang w:val="uk-UA"/>
+        </w:rPr>
+        <w:t>зміни вимог до надійності транспортування та якості теплової енергії</w:t>
+      </w:r>
+      <w:r>
+        <w:rPr>
+          <w:lang w:val="uk-UA"/>
+        </w:rPr>
+        <w:t xml:space="preserve">; </w:t>
+      </w:r>
+      <w:r>
+        <w:rPr>
+          <w:lang w:val="uk-UA"/>
+        </w:rPr>
+        <w:t xml:space="preserve">зміни вимог нормативно-правових актів </w:t>
+      </w:r>
+      <w:r>
+        <w:rPr>
+          <w:bCs/>
+          <w:lang w:val="uk-UA"/>
+        </w:rPr>
+        <w:t>(необхідне підкреслити).</w:t>
       </w:r>
     </w:p>
     <w:p>
@@ -843,9 +1159,6 @@
                 <w:lang w:val="uk-UA"/>
               </w:rPr>
             </w:pPr>
-            <w:r>
-              <w:t xml:space="preserve">{{representativeName}}</w:t>
-            </w:r>
           </w:p>
         </w:tc>
         <w:tc>
@@ -862,9 +1175,6 @@
                 <w:lang w:val="uk-UA"/>
               </w:rPr>
             </w:pPr>
-            <w:r>
-              <w:t xml:space="preserve">{{representativePhone}}</w:t>
-            </w:r>
           </w:p>
         </w:tc>
         <w:tc>
@@ -881,9 +1191,6 @@
                 <w:lang w:val="uk-UA"/>
               </w:rPr>
             </w:pPr>
-            <w:r>
-              <w:t xml:space="preserve">{{representativeEmail}}</w:t>
-            </w:r>
           </w:p>
         </w:tc>
         <w:tc>
@@ -1028,7 +1335,53 @@
         </w:rPr>
       </w:pPr>
       <w:r>
-        <w:t xml:space="preserve">???? {{statementDate}}                         ??????                         {{signerName}}</w:t>
+        <w:rPr>
+          <w:sz w:val="24"/>
+          <w:szCs w:val="24"/>
+        </w:rPr>
+        <w:t>Дата                                                   Підпис</w:t>
+      </w:r>
+      <w:r>
+        <w:rPr>
+          <w:sz w:val="24"/>
+          <w:szCs w:val="24"/>
+        </w:rPr>
+        <w:tab/>
+      </w:r>
+      <w:r>
+        <w:rPr>
+          <w:sz w:val="24"/>
+          <w:szCs w:val="24"/>
+        </w:rPr>
+        <w:tab/>
+      </w:r>
+      <w:r>
+        <w:rPr>
+          <w:sz w:val="24"/>
+          <w:szCs w:val="24"/>
+        </w:rPr>
+        <w:tab/>
+      </w:r>
+      <w:r>
+        <w:rPr>
+          <w:sz w:val="24"/>
+          <w:szCs w:val="24"/>
+        </w:rPr>
+        <w:tab/>
+      </w:r>
+      <w:r>
+        <w:rPr>
+          <w:sz w:val="24"/>
+          <w:szCs w:val="24"/>
+        </w:rPr>
+        <w:t>Прізвище та ініціали</w:t>
+      </w:r>
+      <w:r>
+        <w:rPr>
+          <w:sz w:val="24"/>
+          <w:szCs w:val="24"/>
+        </w:rPr>
+        <w:t xml:space="preserve"> </w:t>
       </w:r>
     </w:p>
     <w:p>

</xml_diff>